<commit_message>
Pushing changes to 4/5/2026
</commit_message>
<xml_diff>
--- a/module-3/kouril-assignment 3.2.docx
+++ b/module-3/kouril-assignment 3.2.docx
@@ -22,10 +22,10 @@
     <w:p>
       <w:r>
         <w:drawing>
-          <wp:inline distT="0" distB="0" distL="0" distR="0" wp14:anchorId="75D3C392" wp14:editId="3250CE77">
-            <wp:extent cx="5943600" cy="5904865"/>
-            <wp:effectExtent l="0" t="0" r="0" b="635"/>
-            <wp:docPr id="818148853" name="Picture 1"/>
+          <wp:inline distT="0" distB="0" distL="0" distR="0" wp14:anchorId="2FB0AA6D" wp14:editId="3969C870">
+            <wp:extent cx="5943600" cy="5860415"/>
+            <wp:effectExtent l="0" t="0" r="0" b="6985"/>
+            <wp:docPr id="820562781" name="Picture 1"/>
             <wp:cNvGraphicFramePr>
               <a:graphicFrameLocks xmlns:a="http://schemas.openxmlformats.org/drawingml/2006/main" noChangeAspect="1"/>
             </wp:cNvGraphicFramePr>
@@ -33,7 +33,7 @@
               <a:graphicData uri="http://schemas.openxmlformats.org/drawingml/2006/picture">
                 <pic:pic xmlns:pic="http://schemas.openxmlformats.org/drawingml/2006/picture">
                   <pic:nvPicPr>
-                    <pic:cNvPr id="818148853" name=""/>
+                    <pic:cNvPr id="820562781" name=""/>
                     <pic:cNvPicPr/>
                   </pic:nvPicPr>
                   <pic:blipFill>
@@ -45,7 +45,7 @@
                   <pic:spPr>
                     <a:xfrm>
                       <a:off x="0" y="0"/>
-                      <a:ext cx="5943600" cy="5904865"/>
+                      <a:ext cx="5943600" cy="5860415"/>
                     </a:xfrm>
                     <a:prstGeom prst="rect">
                       <a:avLst/>
@@ -60,6 +60,9 @@
     </w:p>
     <w:p>
       <w:r>
+        <w:rPr>
+          <w:noProof/>
+        </w:rPr>
         <w:lastRenderedPageBreak/>
         <w:drawing>
           <wp:inline distT="0" distB="0" distL="0" distR="0" wp14:anchorId="3A818850" wp14:editId="753F3911">
@@ -100,6 +103,9 @@
     </w:p>
     <w:p>
       <w:r>
+        <w:rPr>
+          <w:noProof/>
+        </w:rPr>
         <w:lastRenderedPageBreak/>
         <w:drawing>
           <wp:inline distT="0" distB="0" distL="0" distR="0" wp14:anchorId="3C97BCD1" wp14:editId="4DC13780">

</xml_diff>